<commit_message>
feat: Migrate OCR to OpenRouter AI, add model selector UI (v2.0)
BREAKING CHANGE: Thay thế toàn bộ pipeline MinerU 2.5 Pro bằng OpenRouter Vision API.

Thay đổi chính:
- Thêm functions/api/ocr-openrouter.js — endpoint duy nhất hỗ trợ vision mode (PDF/ảnh) và text mode (DOCX/text nhập tay)
- Xóa 5 file MinerU cũ: mineru-upload, mineru-submit, mineru-status, mineru-download, extract-ai
- Thêm UI chọn model AI trực tiếp trên frontend (lưu vào localStorage)
  - Vision: radio list 7 model (free + trả phí, hiển thị giá)
  - Text: priority list model free, user có thể thêm/xóa tùy ý
- Cải thiện prompt theo nguyên tắc high-precision extraction
- Sửa Template_QuyetDinh.docx: paragraph loop cho căn cứ và nội dung, thêm chuc_danh_ban_hanh
- Thêm form field chức danh ban hành trong review form
- Fix layout form-row-2 các ô input không đều chiều cao
- Biến môi trường: MINERU_API_KEY → OPENROUTER_API_KEY

Co-Authored-By: Claude Sonnet 4.6 <noreply@anthropic.com>
</commit_message>
<xml_diff>
--- a/public/templates/Template_QuyetDinh.docx
+++ b/public/templates/Template_QuyetDinh.docx
@@ -187,16 +187,72 @@
     </w:p>
     <w:p>
       <w:pPr>
-        <w:spacing w:after="80" w:line="312" w:lineRule="auto"/>
-        <w:ind w:firstLine="720"/>
+        <w:spacing w:before="120"/>
+        <w:jc w:val="center"/>
       </w:pPr>
       <w:r>
         <w:rPr>
+          <w:b/>
+          <w:bCs/>
           <w:color w:val="000000"/>
           <w:sz w:val="28"/>
           <w:szCs w:val="28"/>
         </w:rPr>
-        <w:t>{{can_cu}}</w:t>
+        <w:t>{{chuc_danh_ban_hanh}}</w:t>
+      </w:r>
+    </w:p>
+    <w:p>
+      <w:pPr>
+        <w:rPr>
+          <w:i/>
+          <w:iCs/>
+        </w:rPr>
+      </w:pPr>
+      <w:r>
+        <w:rPr>
+          <w:i/>
+          <w:iCs/>
+          <w:sz w:val="28"/>
+          <w:szCs w:val="28"/>
+        </w:rPr>
+        <w:t>{{#can_cu_lines}}</w:t>
+      </w:r>
+    </w:p>
+    <w:p>
+      <w:pPr>
+        <w:spacing w:line="312" w:lineRule="auto"/>
+        <w:ind w:firstLine="720"/>
+        <w:rPr>
+          <w:i/>
+          <w:iCs/>
+        </w:rPr>
+      </w:pPr>
+      <w:r>
+        <w:rPr>
+          <w:i/>
+          <w:iCs/>
+          <w:color w:val="000000"/>
+          <w:sz w:val="28"/>
+          <w:szCs w:val="28"/>
+        </w:rPr>
+        <w:t>{{.}}</w:t>
+      </w:r>
+    </w:p>
+    <w:p>
+      <w:pPr>
+        <w:rPr>
+          <w:i/>
+          <w:iCs/>
+        </w:rPr>
+      </w:pPr>
+      <w:r>
+        <w:rPr>
+          <w:i/>
+          <w:iCs/>
+          <w:sz w:val="28"/>
+          <w:szCs w:val="28"/>
+        </w:rPr>
+        <w:t>{{/can_cu_lines}}</w:t>
       </w:r>
     </w:p>
     <w:p>
@@ -216,8 +272,17 @@
       </w:r>
     </w:p>
     <w:p>
-      <w:pPr>
-        <w:spacing w:after="200" w:line="312" w:lineRule="auto"/>
+      <w:r>
+        <w:rPr>
+          <w:sz w:val="28"/>
+          <w:szCs w:val="28"/>
+        </w:rPr>
+        <w:t>{{#noi_dung_lines}}</w:t>
+      </w:r>
+    </w:p>
+    <w:p>
+      <w:pPr>
+        <w:spacing w:after="60" w:line="312" w:lineRule="auto"/>
         <w:ind w:firstLine="720"/>
         <w:jc w:val="both"/>
       </w:pPr>
@@ -227,7 +292,16 @@
           <w:sz w:val="28"/>
           <w:szCs w:val="28"/>
         </w:rPr>
-        <w:t>{{noi_dung_quyet_dinh}}</w:t>
+        <w:t>{{.}}</w:t>
+      </w:r>
+    </w:p>
+    <w:p>
+      <w:r>
+        <w:rPr>
+          <w:sz w:val="28"/>
+          <w:szCs w:val="28"/>
+        </w:rPr>
+        <w:t>{{/noi_dung_lines}}</w:t>
       </w:r>
     </w:p>
     <w:p>

</xml_diff>